<commit_message>
Update SOTJ 2024 Summary results_20241002.docx
</commit_message>
<xml_diff>
--- a/output/tables/2024/SOTJ 2024 Summary results_20241002.docx
+++ b/output/tables/2024/SOTJ 2024 Summary results_20241002.docx
@@ -89,15 +89,7 @@
         </w:numPr>
       </w:pPr>
       <w:r>
-        <w:t xml:space="preserve">We can use all reporting countries and distribute the “aggregate” categories to actual countries while ensuring their sum totals the aggregate value. This approach allows us to utilize all information we have in the </w:t>
-      </w:r>
-      <w:proofErr w:type="spellStart"/>
-      <w:r>
-        <w:t>CbCR</w:t>
-      </w:r>
-      <w:proofErr w:type="spellEnd"/>
-      <w:r>
-        <w:t xml:space="preserve"> data but disregards information from MNEs registered in non-reporting countries.</w:t>
+        <w:t>We can use all reporting countries and distribute the “aggregate” categories to actual countries while ensuring their sum totals the aggregate value. This approach allows us to utilize all information we have in the CbCR data but disregards information from MNEs registered in non-reporting countries.</w:t>
       </w:r>
     </w:p>
     <w:p>
@@ -121,15 +113,7 @@
         </w:numPr>
       </w:pPr>
       <w:r>
-        <w:t xml:space="preserve">I </w:t>
-      </w:r>
-      <w:proofErr w:type="gramStart"/>
-      <w:r>
-        <w:t>report</w:t>
-      </w:r>
-      <w:proofErr w:type="gramEnd"/>
-      <w:r>
-        <w:t xml:space="preserve"> the results of all samples below. For those including predictions, we could use multiple samples with different predictions (bootstrapping). This is included in the notebooks, but here I only use one sample as I did not have enough time for bootstrapping. The results do not vary significantly across bootstrapped samples.</w:t>
+        <w:t>I report the results of all samples below. For those including predictions, we could use multiple samples with different predictions (bootstrapping). This is included in the notebooks, but here I only use one sample as I did not have enough time for bootstrapping. The results do not vary significantly across bootstrapped samples.</w:t>
       </w:r>
     </w:p>
     <w:p>
@@ -161,23 +145,7 @@
         </w:numPr>
       </w:pPr>
       <w:r>
-        <w:t xml:space="preserve">We use Orbis data to determine which country should report on </w:t>
-      </w:r>
-      <w:proofErr w:type="spellStart"/>
-      <w:r>
-        <w:t>CbCR</w:t>
-      </w:r>
-      <w:proofErr w:type="spellEnd"/>
-      <w:r>
-        <w:t xml:space="preserve"> (i.e. has at least Global Ultimate Owner (GUO) above the revenue threshold). However, this Orbis data is quite </w:t>
-      </w:r>
-      <w:proofErr w:type="gramStart"/>
-      <w:r>
-        <w:t>old</w:t>
-      </w:r>
-      <w:proofErr w:type="gramEnd"/>
-      <w:r>
-        <w:t xml:space="preserve"> and I do not know where it comes from. So far, I have included only countries that report at least two GUOs, as we get super high estimates for a few countries (like Liberia) otherwise. If we can improve the Orbis data, we should set that back to requiring only one GUO.</w:t>
+        <w:t>We use Orbis data to determine which country should report on CbCR (i.e. has at least Global Ultimate Owner (GUO) above the revenue threshold). However, this Orbis data is quite old and I do not know where it comes from. So far, I have included only countries that report at least two GUOs, as we get super high estimates for a few countries (like Liberia) otherwise. If we can improve the Orbis data, we should set that back to requiring only one GUO.</w:t>
       </w:r>
     </w:p>
     <w:p>
@@ -189,15 +157,7 @@
         </w:numPr>
       </w:pPr>
       <w:r>
-        <w:t xml:space="preserve">The tax revenue data in the current sample should be double checked, especially for 2017. It seems that there is a </w:t>
-      </w:r>
-      <w:proofErr w:type="gramStart"/>
-      <w:r>
-        <w:t>problem/outliers</w:t>
-      </w:r>
-      <w:proofErr w:type="gramEnd"/>
-      <w:r>
-        <w:t xml:space="preserve"> there.</w:t>
+        <w:t>The tax revenue data in the current sample should be double checked, especially for 2017. It seems that there is a problem/outliers there.</w:t>
       </w:r>
     </w:p>
     <w:p>
@@ -209,15 +169,7 @@
         </w:numPr>
       </w:pPr>
       <w:r>
-        <w:t xml:space="preserve">It might also make sense to </w:t>
-      </w:r>
-      <w:proofErr w:type="gramStart"/>
-      <w:r>
-        <w:t>double check</w:t>
-      </w:r>
-      <w:proofErr w:type="gramEnd"/>
-      <w:r>
-        <w:t xml:space="preserve"> the health expenditure data.</w:t>
+        <w:t>It might also make sense to double check the health expenditure data.</w:t>
       </w:r>
     </w:p>
     <w:p>
@@ -242,7 +194,13 @@
         <w:spacing w:line="256" w:lineRule="auto"/>
       </w:pPr>
       <w:r>
-        <w:t>Minor: The figures created in the 4_figures notebook are not stored anywhere so far, I just copy pasted them here.</w:t>
+        <w:t>Minor: The figures created in the 4_</w:t>
+      </w:r>
+      <w:r>
+        <w:t>create_</w:t>
+      </w:r>
+      <w:r>
+        <w:t>figures notebook are not stored anywhere so far, I just copy pasted them here.</w:t>
       </w:r>
     </w:p>
     <w:p/>
@@ -1993,67 +1951,7 @@
                 <w:lang w:val="de-DE"/>
                 <w14:ligatures w14:val="none"/>
               </w:rPr>
-              <w:t xml:space="preserve">Austria, </w:t>
-            </w:r>
-            <w:proofErr w:type="spellStart"/>
-            <w:r>
-              <w:rPr>
-                <w:rFonts w:ascii="Aptos Narrow" w:eastAsia="Times New Roman" w:hAnsi="Aptos Narrow" w:cs="Times New Roman"/>
-                <w:color w:val="000000"/>
-                <w:lang w:val="de-DE"/>
-                <w14:ligatures w14:val="none"/>
-              </w:rPr>
-              <w:t>Finland</w:t>
-            </w:r>
-            <w:proofErr w:type="spellEnd"/>
-            <w:r>
-              <w:rPr>
-                <w:rFonts w:ascii="Aptos Narrow" w:eastAsia="Times New Roman" w:hAnsi="Aptos Narrow" w:cs="Times New Roman"/>
-                <w:color w:val="000000"/>
-                <w:lang w:val="de-DE"/>
-                <w14:ligatures w14:val="none"/>
-              </w:rPr>
-              <w:t xml:space="preserve">, Korea, Mauritius, </w:t>
-            </w:r>
-            <w:proofErr w:type="spellStart"/>
-            <w:r>
-              <w:rPr>
-                <w:rFonts w:ascii="Aptos Narrow" w:eastAsia="Times New Roman" w:hAnsi="Aptos Narrow" w:cs="Times New Roman"/>
-                <w:color w:val="000000"/>
-                <w:lang w:val="de-DE"/>
-                <w14:ligatures w14:val="none"/>
-              </w:rPr>
-              <w:t>Poland</w:t>
-            </w:r>
-            <w:proofErr w:type="spellEnd"/>
-            <w:r>
-              <w:rPr>
-                <w:rFonts w:ascii="Aptos Narrow" w:eastAsia="Times New Roman" w:hAnsi="Aptos Narrow" w:cs="Times New Roman"/>
-                <w:color w:val="000000"/>
-                <w:lang w:val="de-DE"/>
-                <w14:ligatures w14:val="none"/>
-              </w:rPr>
-              <w:t xml:space="preserve">, </w:t>
-            </w:r>
-            <w:proofErr w:type="spellStart"/>
-            <w:r>
-              <w:rPr>
-                <w:rFonts w:ascii="Aptos Narrow" w:eastAsia="Times New Roman" w:hAnsi="Aptos Narrow" w:cs="Times New Roman"/>
-                <w:color w:val="000000"/>
-                <w:lang w:val="de-DE"/>
-                <w14:ligatures w14:val="none"/>
-              </w:rPr>
-              <w:t>Sweden</w:t>
-            </w:r>
-            <w:proofErr w:type="spellEnd"/>
-            <w:r>
-              <w:rPr>
-                <w:rFonts w:ascii="Aptos Narrow" w:eastAsia="Times New Roman" w:hAnsi="Aptos Narrow" w:cs="Times New Roman"/>
-                <w:color w:val="000000"/>
-                <w:lang w:val="de-DE"/>
-                <w14:ligatures w14:val="none"/>
-              </w:rPr>
-              <w:t>, UK</w:t>
+              <w:t>Austria, Finland, Korea, Mauritius, Poland, Sweden, UK</w:t>
             </w:r>
           </w:p>
         </w:tc>
@@ -8280,15 +8178,6 @@
   </w:num>
   <w:num w:numId="8" w16cid:durableId="970550555">
     <w:abstractNumId w:val="3"/>
-    <w:lvlOverride w:ilvl="0"/>
-    <w:lvlOverride w:ilvl="1"/>
-    <w:lvlOverride w:ilvl="2"/>
-    <w:lvlOverride w:ilvl="3"/>
-    <w:lvlOverride w:ilvl="4"/>
-    <w:lvlOverride w:ilvl="5"/>
-    <w:lvlOverride w:ilvl="6"/>
-    <w:lvlOverride w:ilvl="7"/>
-    <w:lvlOverride w:ilvl="8"/>
   </w:num>
 </w:numbering>
 </file>

</xml_diff>